<commit_message>
Fix report second time
</commit_message>
<xml_diff>
--- a/лр2 СПО Михлин Платонова.docx
+++ b/лр2 СПО Михлин Платонова.docx
@@ -1319,58 +1319,128 @@
           <w:sz w:val="20"/>
           <w:szCs w:val="20"/>
         </w:rPr>
-        <w:t xml:space="preserve">    match n {</w:t>
-      </w:r>
-    </w:p>
-    <w:p>
-      <w:pPr>
-        <w:rPr>
-          <w:rFonts w:ascii="Consolas" w:hAnsi="Consolas"/>
-          <w:sz w:val="20"/>
-          <w:szCs w:val="20"/>
-        </w:rPr>
-      </w:pPr>
-      <w:r>
-        <w:rPr>
-          <w:rFonts w:ascii="Consolas" w:hAnsi="Consolas"/>
-          <w:sz w:val="20"/>
-          <w:szCs w:val="20"/>
-        </w:rPr>
-        <w:t xml:space="preserve">        0 =&gt; "zero",</w:t>
-      </w:r>
-    </w:p>
-    <w:p>
-      <w:pPr>
-        <w:rPr>
-          <w:rFonts w:ascii="Consolas" w:hAnsi="Consolas"/>
-          <w:sz w:val="20"/>
-          <w:szCs w:val="20"/>
-        </w:rPr>
-      </w:pPr>
-      <w:r>
-        <w:rPr>
-          <w:rFonts w:ascii="Consolas" w:hAnsi="Consolas"/>
-          <w:sz w:val="20"/>
-          <w:szCs w:val="20"/>
-        </w:rPr>
-        <w:t xml:space="preserve">        1 | 2 | 3 =&gt; "small",</w:t>
-      </w:r>
-    </w:p>
-    <w:p>
-      <w:pPr>
-        <w:rPr>
-          <w:rFonts w:ascii="Consolas" w:hAnsi="Consolas"/>
-          <w:sz w:val="20"/>
-          <w:szCs w:val="20"/>
-        </w:rPr>
-      </w:pPr>
-      <w:r>
-        <w:rPr>
-          <w:rFonts w:ascii="Consolas" w:hAnsi="Consolas"/>
-          <w:sz w:val="20"/>
-          <w:szCs w:val="20"/>
-        </w:rPr>
-        <w:t xml:space="preserve">        _ =&gt; "other",</w:t>
+        <w:t xml:space="preserve">    for </w:t>
+      </w:r>
+      <w:proofErr w:type="spellStart"/>
+      <w:r>
+        <w:rPr>
+          <w:rFonts w:ascii="Consolas" w:hAnsi="Consolas"/>
+          <w:sz w:val="20"/>
+          <w:szCs w:val="20"/>
+        </w:rPr>
+        <w:t>i</w:t>
+      </w:r>
+      <w:proofErr w:type="spellEnd"/>
+      <w:r>
+        <w:rPr>
+          <w:rFonts w:ascii="Consolas" w:hAnsi="Consolas"/>
+          <w:sz w:val="20"/>
+          <w:szCs w:val="20"/>
+        </w:rPr>
+        <w:t xml:space="preserve"> in </w:t>
+      </w:r>
+      <w:proofErr w:type="gramStart"/>
+      <w:r>
+        <w:rPr>
+          <w:rFonts w:ascii="Consolas" w:hAnsi="Consolas"/>
+          <w:sz w:val="20"/>
+          <w:szCs w:val="20"/>
+        </w:rPr>
+        <w:t>1..</w:t>
+      </w:r>
+      <w:proofErr w:type="gramEnd"/>
+      <w:r>
+        <w:rPr>
+          <w:rFonts w:ascii="Consolas" w:hAnsi="Consolas"/>
+          <w:sz w:val="20"/>
+          <w:szCs w:val="20"/>
+        </w:rPr>
+        <w:t>=n {</w:t>
+      </w:r>
+    </w:p>
+    <w:p>
+      <w:pPr>
+        <w:rPr>
+          <w:rFonts w:ascii="Consolas" w:hAnsi="Consolas"/>
+          <w:sz w:val="20"/>
+          <w:szCs w:val="20"/>
+        </w:rPr>
+      </w:pPr>
+      <w:r>
+        <w:rPr>
+          <w:rFonts w:ascii="Consolas" w:hAnsi="Consolas"/>
+          <w:sz w:val="20"/>
+          <w:szCs w:val="20"/>
+        </w:rPr>
+        <w:t xml:space="preserve">        match n {</w:t>
+      </w:r>
+    </w:p>
+    <w:p>
+      <w:pPr>
+        <w:rPr>
+          <w:rFonts w:ascii="Consolas" w:hAnsi="Consolas"/>
+          <w:sz w:val="20"/>
+          <w:szCs w:val="20"/>
+        </w:rPr>
+      </w:pPr>
+      <w:r>
+        <w:rPr>
+          <w:rFonts w:ascii="Consolas" w:hAnsi="Consolas"/>
+          <w:sz w:val="20"/>
+          <w:szCs w:val="20"/>
+        </w:rPr>
+        <w:t xml:space="preserve">            0 =&gt; "zero",</w:t>
+      </w:r>
+    </w:p>
+    <w:p>
+      <w:pPr>
+        <w:rPr>
+          <w:rFonts w:ascii="Consolas" w:hAnsi="Consolas"/>
+          <w:sz w:val="20"/>
+          <w:szCs w:val="20"/>
+        </w:rPr>
+      </w:pPr>
+      <w:r>
+        <w:rPr>
+          <w:rFonts w:ascii="Consolas" w:hAnsi="Consolas"/>
+          <w:sz w:val="20"/>
+          <w:szCs w:val="20"/>
+        </w:rPr>
+        <w:t xml:space="preserve">            1 | 2 | 3 =&gt; "small",</w:t>
+      </w:r>
+    </w:p>
+    <w:p>
+      <w:pPr>
+        <w:rPr>
+          <w:rFonts w:ascii="Consolas" w:hAnsi="Consolas"/>
+          <w:sz w:val="20"/>
+          <w:szCs w:val="20"/>
+        </w:rPr>
+      </w:pPr>
+      <w:r>
+        <w:rPr>
+          <w:rFonts w:ascii="Consolas" w:hAnsi="Consolas"/>
+          <w:sz w:val="20"/>
+          <w:szCs w:val="20"/>
+        </w:rPr>
+        <w:t xml:space="preserve">            _ =&gt; "other",</w:t>
+      </w:r>
+    </w:p>
+    <w:p>
+      <w:pPr>
+        <w:rPr>
+          <w:rFonts w:ascii="Consolas" w:hAnsi="Consolas"/>
+          <w:sz w:val="20"/>
+          <w:szCs w:val="20"/>
+        </w:rPr>
+      </w:pPr>
+      <w:r>
+        <w:rPr>
+          <w:rFonts w:ascii="Consolas" w:hAnsi="Consolas"/>
+          <w:sz w:val="20"/>
+          <w:szCs w:val="20"/>
+        </w:rPr>
+        <w:t xml:space="preserve">        }</w:t>
       </w:r>
     </w:p>
     <w:p>
@@ -1997,6 +2067,7 @@
           <w:sz w:val="20"/>
           <w:szCs w:val="20"/>
         </w:rPr>
+        <w:lastRenderedPageBreak/>
         <w:t xml:space="preserve">        if </w:t>
       </w:r>
       <w:proofErr w:type="spellStart"/>
@@ -2077,7 +2148,6 @@
           <w:sz w:val="20"/>
           <w:szCs w:val="20"/>
         </w:rPr>
-        <w:lastRenderedPageBreak/>
         <w:t xml:space="preserve">        }</w:t>
       </w:r>
     </w:p>
@@ -3648,7 +3718,6 @@
           <w:szCs w:val="28"/>
           <w:lang w:val="be-BY"/>
         </w:rPr>
-        <w:lastRenderedPageBreak/>
         <w:t>Блок-схема</w:t>
       </w:r>
       <w:r>
@@ -3888,7 +3957,6 @@
           <w:bCs/>
           <w:sz w:val="28"/>
           <w:szCs w:val="28"/>
-          <w:lang w:val="en-US"/>
         </w:rPr>
       </w:pPr>
       <w:r>
@@ -3919,7 +3987,6 @@
           <w:bCs/>
           <w:sz w:val="28"/>
           <w:szCs w:val="28"/>
-          <w:lang w:val="en-US"/>
         </w:rPr>
         <w:t xml:space="preserve"> </w:t>
       </w:r>
@@ -3960,7 +4027,6 @@
           <w:bCs/>
           <w:sz w:val="28"/>
           <w:szCs w:val="28"/>
-          <w:lang w:val="en-US"/>
         </w:rPr>
         <w:t>:</w:t>
       </w:r>
@@ -3973,7 +4039,6 @@
           <w:rFonts w:ascii="Times New Roman" w:hAnsi="Times New Roman" w:cs="Times New Roman"/>
           <w:sz w:val="28"/>
           <w:szCs w:val="28"/>
-          <w:lang w:val="en-US"/>
         </w:rPr>
       </w:pPr>
     </w:p>
@@ -3985,67 +4050,63 @@
           <w:rFonts w:ascii="Times New Roman" w:hAnsi="Times New Roman" w:cs="Times New Roman"/>
           <w:sz w:val="28"/>
           <w:szCs w:val="28"/>
+        </w:rPr>
+      </w:pPr>
+      <w:r>
+        <w:rPr>
+          <w:rFonts w:ascii="Times New Roman" w:hAnsi="Times New Roman" w:cs="Times New Roman"/>
+          <w:sz w:val="28"/>
+          <w:szCs w:val="28"/>
+        </w:rPr>
+        <w:t>Абсолютная</w:t>
+      </w:r>
+      <w:r>
+        <w:rPr>
+          <w:rFonts w:ascii="Times New Roman" w:hAnsi="Times New Roman" w:cs="Times New Roman"/>
+          <w:sz w:val="28"/>
+          <w:szCs w:val="28"/>
+        </w:rPr>
+        <w:t xml:space="preserve"> </w:t>
+      </w:r>
+      <w:r>
+        <w:rPr>
+          <w:rFonts w:ascii="Times New Roman" w:hAnsi="Times New Roman" w:cs="Times New Roman"/>
+          <w:sz w:val="28"/>
+          <w:szCs w:val="28"/>
+        </w:rPr>
+        <w:t>сложность</w:t>
+      </w:r>
+      <w:r>
+        <w:rPr>
+          <w:rFonts w:ascii="Times New Roman" w:hAnsi="Times New Roman" w:cs="Times New Roman"/>
+          <w:sz w:val="28"/>
+          <w:szCs w:val="28"/>
+        </w:rPr>
+        <w:t xml:space="preserve"> </w:t>
+      </w:r>
+      <w:r>
+        <w:rPr>
+          <w:rFonts w:ascii="Times New Roman" w:hAnsi="Times New Roman" w:cs="Times New Roman"/>
+          <w:sz w:val="28"/>
+          <w:szCs w:val="28"/>
+        </w:rPr>
+        <w:t>программы</w:t>
+      </w:r>
+      <w:r>
+        <w:rPr>
+          <w:rFonts w:ascii="Times New Roman" w:hAnsi="Times New Roman" w:cs="Times New Roman"/>
+          <w:sz w:val="28"/>
+          <w:szCs w:val="28"/>
+        </w:rPr>
+        <w:t xml:space="preserve"> </w:t>
+      </w:r>
+      <w:r>
+        <w:rPr>
+          <w:rFonts w:ascii="Times New Roman" w:hAnsi="Times New Roman" w:cs="Times New Roman"/>
+          <w:sz w:val="28"/>
+          <w:szCs w:val="28"/>
           <w:lang w:val="en-US"/>
         </w:rPr>
-      </w:pPr>
-      <w:r>
-        <w:rPr>
-          <w:rFonts w:ascii="Times New Roman" w:hAnsi="Times New Roman" w:cs="Times New Roman"/>
-          <w:sz w:val="28"/>
-          <w:szCs w:val="28"/>
-        </w:rPr>
-        <w:t>Абсолютная</w:t>
-      </w:r>
-      <w:r>
-        <w:rPr>
-          <w:rFonts w:ascii="Times New Roman" w:hAnsi="Times New Roman" w:cs="Times New Roman"/>
-          <w:sz w:val="28"/>
-          <w:szCs w:val="28"/>
-          <w:lang w:val="en-US"/>
-        </w:rPr>
-        <w:t xml:space="preserve"> </w:t>
-      </w:r>
-      <w:r>
-        <w:rPr>
-          <w:rFonts w:ascii="Times New Roman" w:hAnsi="Times New Roman" w:cs="Times New Roman"/>
-          <w:sz w:val="28"/>
-          <w:szCs w:val="28"/>
-        </w:rPr>
-        <w:t>сложность</w:t>
-      </w:r>
-      <w:r>
-        <w:rPr>
-          <w:rFonts w:ascii="Times New Roman" w:hAnsi="Times New Roman" w:cs="Times New Roman"/>
-          <w:sz w:val="28"/>
-          <w:szCs w:val="28"/>
-          <w:lang w:val="en-US"/>
-        </w:rPr>
-        <w:t xml:space="preserve"> </w:t>
-      </w:r>
-      <w:r>
-        <w:rPr>
-          <w:rFonts w:ascii="Times New Roman" w:hAnsi="Times New Roman" w:cs="Times New Roman"/>
-          <w:sz w:val="28"/>
-          <w:szCs w:val="28"/>
-        </w:rPr>
-        <w:t>программы</w:t>
-      </w:r>
-      <w:r>
-        <w:rPr>
-          <w:rFonts w:ascii="Times New Roman" w:hAnsi="Times New Roman" w:cs="Times New Roman"/>
-          <w:sz w:val="28"/>
-          <w:szCs w:val="28"/>
-          <w:lang w:val="en-US"/>
-        </w:rPr>
-        <w:t xml:space="preserve"> </w:t>
-      </w:r>
-      <w:r>
-        <w:rPr>
-          <w:rFonts w:ascii="Times New Roman" w:hAnsi="Times New Roman" w:cs="Times New Roman"/>
-          <w:sz w:val="28"/>
-          <w:szCs w:val="28"/>
-          <w:lang w:val="en-US"/>
-        </w:rPr>
         <w:t>CL</w:t>
       </w:r>
       <w:r>
@@ -4053,7 +4114,6 @@
           <w:rFonts w:ascii="Times New Roman" w:hAnsi="Times New Roman" w:cs="Times New Roman"/>
           <w:sz w:val="28"/>
           <w:szCs w:val="28"/>
-          <w:lang w:val="en-US"/>
         </w:rPr>
         <w:t xml:space="preserve"> = 20</w:t>
       </w:r>
@@ -4066,67 +4126,63 @@
           <w:rFonts w:ascii="Times New Roman" w:hAnsi="Times New Roman" w:cs="Times New Roman"/>
           <w:sz w:val="28"/>
           <w:szCs w:val="28"/>
+        </w:rPr>
+      </w:pPr>
+      <w:r>
+        <w:rPr>
+          <w:rFonts w:ascii="Times New Roman" w:hAnsi="Times New Roman" w:cs="Times New Roman"/>
+          <w:sz w:val="28"/>
+          <w:szCs w:val="28"/>
+        </w:rPr>
+        <w:t>Относительная</w:t>
+      </w:r>
+      <w:r>
+        <w:rPr>
+          <w:rFonts w:ascii="Times New Roman" w:hAnsi="Times New Roman" w:cs="Times New Roman"/>
+          <w:sz w:val="28"/>
+          <w:szCs w:val="28"/>
+        </w:rPr>
+        <w:t xml:space="preserve"> </w:t>
+      </w:r>
+      <w:r>
+        <w:rPr>
+          <w:rFonts w:ascii="Times New Roman" w:hAnsi="Times New Roman" w:cs="Times New Roman"/>
+          <w:sz w:val="28"/>
+          <w:szCs w:val="28"/>
+        </w:rPr>
+        <w:t>сложность</w:t>
+      </w:r>
+      <w:r>
+        <w:rPr>
+          <w:rFonts w:ascii="Times New Roman" w:hAnsi="Times New Roman" w:cs="Times New Roman"/>
+          <w:sz w:val="28"/>
+          <w:szCs w:val="28"/>
+        </w:rPr>
+        <w:t xml:space="preserve"> </w:t>
+      </w:r>
+      <w:r>
+        <w:rPr>
+          <w:rFonts w:ascii="Times New Roman" w:hAnsi="Times New Roman" w:cs="Times New Roman"/>
+          <w:sz w:val="28"/>
+          <w:szCs w:val="28"/>
+        </w:rPr>
+        <w:t>программы</w:t>
+      </w:r>
+      <w:r>
+        <w:rPr>
+          <w:rFonts w:ascii="Times New Roman" w:hAnsi="Times New Roman" w:cs="Times New Roman"/>
+          <w:sz w:val="28"/>
+          <w:szCs w:val="28"/>
+        </w:rPr>
+        <w:t xml:space="preserve"> </w:t>
+      </w:r>
+      <w:r>
+        <w:rPr>
+          <w:rFonts w:ascii="Times New Roman" w:hAnsi="Times New Roman" w:cs="Times New Roman"/>
+          <w:sz w:val="28"/>
+          <w:szCs w:val="28"/>
           <w:lang w:val="en-US"/>
         </w:rPr>
-      </w:pPr>
-      <w:r>
-        <w:rPr>
-          <w:rFonts w:ascii="Times New Roman" w:hAnsi="Times New Roman" w:cs="Times New Roman"/>
-          <w:sz w:val="28"/>
-          <w:szCs w:val="28"/>
-        </w:rPr>
-        <w:t>Относительная</w:t>
-      </w:r>
-      <w:r>
-        <w:rPr>
-          <w:rFonts w:ascii="Times New Roman" w:hAnsi="Times New Roman" w:cs="Times New Roman"/>
-          <w:sz w:val="28"/>
-          <w:szCs w:val="28"/>
-          <w:lang w:val="en-US"/>
-        </w:rPr>
-        <w:t xml:space="preserve"> </w:t>
-      </w:r>
-      <w:r>
-        <w:rPr>
-          <w:rFonts w:ascii="Times New Roman" w:hAnsi="Times New Roman" w:cs="Times New Roman"/>
-          <w:sz w:val="28"/>
-          <w:szCs w:val="28"/>
-        </w:rPr>
-        <w:t>сложность</w:t>
-      </w:r>
-      <w:r>
-        <w:rPr>
-          <w:rFonts w:ascii="Times New Roman" w:hAnsi="Times New Roman" w:cs="Times New Roman"/>
-          <w:sz w:val="28"/>
-          <w:szCs w:val="28"/>
-          <w:lang w:val="en-US"/>
-        </w:rPr>
-        <w:t xml:space="preserve"> </w:t>
-      </w:r>
-      <w:r>
-        <w:rPr>
-          <w:rFonts w:ascii="Times New Roman" w:hAnsi="Times New Roman" w:cs="Times New Roman"/>
-          <w:sz w:val="28"/>
-          <w:szCs w:val="28"/>
-        </w:rPr>
-        <w:t>программы</w:t>
-      </w:r>
-      <w:r>
-        <w:rPr>
-          <w:rFonts w:ascii="Times New Roman" w:hAnsi="Times New Roman" w:cs="Times New Roman"/>
-          <w:sz w:val="28"/>
-          <w:szCs w:val="28"/>
-          <w:lang w:val="en-US"/>
-        </w:rPr>
-        <w:t xml:space="preserve"> </w:t>
-      </w:r>
-      <w:r>
-        <w:rPr>
-          <w:rFonts w:ascii="Times New Roman" w:hAnsi="Times New Roman" w:cs="Times New Roman"/>
-          <w:sz w:val="28"/>
-          <w:szCs w:val="28"/>
-          <w:lang w:val="en-US"/>
-        </w:rPr>
         <w:t>cl</w:t>
       </w:r>
       <w:r>
@@ -4134,7 +4190,6 @@
           <w:rFonts w:ascii="Times New Roman" w:hAnsi="Times New Roman" w:cs="Times New Roman"/>
           <w:sz w:val="28"/>
           <w:szCs w:val="28"/>
-          <w:lang w:val="en-US"/>
         </w:rPr>
         <w:t xml:space="preserve"> = 20 / 59 = 0.339</w:t>
       </w:r>
@@ -4147,101 +4202,95 @@
           <w:rFonts w:ascii="Times New Roman" w:hAnsi="Times New Roman" w:cs="Times New Roman"/>
           <w:sz w:val="28"/>
           <w:szCs w:val="28"/>
+        </w:rPr>
+      </w:pPr>
+      <w:r>
+        <w:rPr>
+          <w:rFonts w:ascii="Times New Roman" w:hAnsi="Times New Roman" w:cs="Times New Roman"/>
+          <w:sz w:val="28"/>
+          <w:szCs w:val="28"/>
+        </w:rPr>
+        <w:t>Максимальный</w:t>
+      </w:r>
+      <w:r>
+        <w:rPr>
+          <w:rFonts w:ascii="Times New Roman" w:hAnsi="Times New Roman" w:cs="Times New Roman"/>
+          <w:sz w:val="28"/>
+          <w:szCs w:val="28"/>
+        </w:rPr>
+        <w:t xml:space="preserve"> </w:t>
+      </w:r>
+      <w:r>
+        <w:rPr>
+          <w:rFonts w:ascii="Times New Roman" w:hAnsi="Times New Roman" w:cs="Times New Roman"/>
+          <w:sz w:val="28"/>
+          <w:szCs w:val="28"/>
+        </w:rPr>
+        <w:t>уровень</w:t>
+      </w:r>
+      <w:r>
+        <w:rPr>
+          <w:rFonts w:ascii="Times New Roman" w:hAnsi="Times New Roman" w:cs="Times New Roman"/>
+          <w:sz w:val="28"/>
+          <w:szCs w:val="28"/>
+        </w:rPr>
+        <w:t xml:space="preserve"> </w:t>
+      </w:r>
+      <w:r>
+        <w:rPr>
+          <w:rFonts w:ascii="Times New Roman" w:hAnsi="Times New Roman" w:cs="Times New Roman"/>
+          <w:sz w:val="28"/>
+          <w:szCs w:val="28"/>
+        </w:rPr>
+        <w:t>вложенности</w:t>
+      </w:r>
+      <w:r>
+        <w:rPr>
+          <w:rFonts w:ascii="Times New Roman" w:hAnsi="Times New Roman" w:cs="Times New Roman"/>
+          <w:sz w:val="28"/>
+          <w:szCs w:val="28"/>
+        </w:rPr>
+        <w:t xml:space="preserve"> </w:t>
+      </w:r>
+      <w:r>
+        <w:rPr>
+          <w:rFonts w:ascii="Times New Roman" w:hAnsi="Times New Roman" w:cs="Times New Roman"/>
+          <w:sz w:val="28"/>
+          <w:szCs w:val="28"/>
+        </w:rPr>
+        <w:t>условного</w:t>
+      </w:r>
+      <w:r>
+        <w:rPr>
+          <w:rFonts w:ascii="Times New Roman" w:hAnsi="Times New Roman" w:cs="Times New Roman"/>
+          <w:sz w:val="28"/>
+          <w:szCs w:val="28"/>
+        </w:rPr>
+        <w:t xml:space="preserve"> </w:t>
+      </w:r>
+      <w:r>
+        <w:rPr>
+          <w:rFonts w:ascii="Times New Roman" w:hAnsi="Times New Roman" w:cs="Times New Roman"/>
+          <w:sz w:val="28"/>
+          <w:szCs w:val="28"/>
+        </w:rPr>
+        <w:t>оператора</w:t>
+      </w:r>
+      <w:r>
+        <w:rPr>
+          <w:rFonts w:ascii="Times New Roman" w:hAnsi="Times New Roman" w:cs="Times New Roman"/>
+          <w:sz w:val="28"/>
+          <w:szCs w:val="28"/>
+        </w:rPr>
+        <w:t xml:space="preserve"> </w:t>
+      </w:r>
+      <w:r>
+        <w:rPr>
+          <w:rFonts w:ascii="Times New Roman" w:hAnsi="Times New Roman" w:cs="Times New Roman"/>
+          <w:sz w:val="28"/>
+          <w:szCs w:val="28"/>
           <w:lang w:val="en-US"/>
         </w:rPr>
-      </w:pPr>
-      <w:r>
-        <w:rPr>
-          <w:rFonts w:ascii="Times New Roman" w:hAnsi="Times New Roman" w:cs="Times New Roman"/>
-          <w:sz w:val="28"/>
-          <w:szCs w:val="28"/>
-        </w:rPr>
-        <w:t>Максимальный</w:t>
-      </w:r>
-      <w:r>
-        <w:rPr>
-          <w:rFonts w:ascii="Times New Roman" w:hAnsi="Times New Roman" w:cs="Times New Roman"/>
-          <w:sz w:val="28"/>
-          <w:szCs w:val="28"/>
-          <w:lang w:val="en-US"/>
-        </w:rPr>
-        <w:t xml:space="preserve"> </w:t>
-      </w:r>
-      <w:r>
-        <w:rPr>
-          <w:rFonts w:ascii="Times New Roman" w:hAnsi="Times New Roman" w:cs="Times New Roman"/>
-          <w:sz w:val="28"/>
-          <w:szCs w:val="28"/>
-        </w:rPr>
-        <w:t>уровень</w:t>
-      </w:r>
-      <w:r>
-        <w:rPr>
-          <w:rFonts w:ascii="Times New Roman" w:hAnsi="Times New Roman" w:cs="Times New Roman"/>
-          <w:sz w:val="28"/>
-          <w:szCs w:val="28"/>
-          <w:lang w:val="en-US"/>
-        </w:rPr>
-        <w:t xml:space="preserve"> </w:t>
-      </w:r>
-      <w:r>
-        <w:rPr>
-          <w:rFonts w:ascii="Times New Roman" w:hAnsi="Times New Roman" w:cs="Times New Roman"/>
-          <w:sz w:val="28"/>
-          <w:szCs w:val="28"/>
-        </w:rPr>
-        <w:t>вложенности</w:t>
-      </w:r>
-      <w:r>
-        <w:rPr>
-          <w:rFonts w:ascii="Times New Roman" w:hAnsi="Times New Roman" w:cs="Times New Roman"/>
-          <w:sz w:val="28"/>
-          <w:szCs w:val="28"/>
-          <w:lang w:val="en-US"/>
-        </w:rPr>
-        <w:t xml:space="preserve"> </w:t>
-      </w:r>
-      <w:r>
-        <w:rPr>
-          <w:rFonts w:ascii="Times New Roman" w:hAnsi="Times New Roman" w:cs="Times New Roman"/>
-          <w:sz w:val="28"/>
-          <w:szCs w:val="28"/>
-        </w:rPr>
-        <w:t>условного</w:t>
-      </w:r>
-      <w:r>
-        <w:rPr>
-          <w:rFonts w:ascii="Times New Roman" w:hAnsi="Times New Roman" w:cs="Times New Roman"/>
-          <w:sz w:val="28"/>
-          <w:szCs w:val="28"/>
-          <w:lang w:val="en-US"/>
-        </w:rPr>
-        <w:t xml:space="preserve"> </w:t>
-      </w:r>
-      <w:r>
-        <w:rPr>
-          <w:rFonts w:ascii="Times New Roman" w:hAnsi="Times New Roman" w:cs="Times New Roman"/>
-          <w:sz w:val="28"/>
-          <w:szCs w:val="28"/>
-        </w:rPr>
-        <w:t>оператора</w:t>
-      </w:r>
-      <w:r>
-        <w:rPr>
-          <w:rFonts w:ascii="Times New Roman" w:hAnsi="Times New Roman" w:cs="Times New Roman"/>
-          <w:sz w:val="28"/>
-          <w:szCs w:val="28"/>
-          <w:lang w:val="en-US"/>
-        </w:rPr>
-        <w:t xml:space="preserve"> </w:t>
-      </w:r>
-      <w:r>
-        <w:rPr>
-          <w:rFonts w:ascii="Times New Roman" w:hAnsi="Times New Roman" w:cs="Times New Roman"/>
-          <w:sz w:val="28"/>
-          <w:szCs w:val="28"/>
-          <w:lang w:val="en-US"/>
-        </w:rPr>
         <w:t>CLI</w:t>
       </w:r>
       <w:r>
@@ -4249,7 +4298,6 @@
           <w:rFonts w:ascii="Times New Roman" w:hAnsi="Times New Roman" w:cs="Times New Roman"/>
           <w:sz w:val="28"/>
           <w:szCs w:val="28"/>
-          <w:lang w:val="en-US"/>
         </w:rPr>
         <w:t xml:space="preserve"> = 4</w:t>
       </w:r>
@@ -4262,7 +4310,6 @@
           <w:rFonts w:ascii="Times New Roman" w:hAnsi="Times New Roman" w:cs="Times New Roman"/>
           <w:sz w:val="28"/>
           <w:szCs w:val="28"/>
-          <w:lang w:val="en-US"/>
         </w:rPr>
       </w:pPr>
     </w:p>
@@ -4274,7 +4321,6 @@
           <w:rFonts w:ascii="Times New Roman" w:hAnsi="Times New Roman" w:cs="Times New Roman"/>
           <w:sz w:val="28"/>
           <w:szCs w:val="28"/>
-          <w:lang w:val="en-US"/>
         </w:rPr>
       </w:pPr>
     </w:p>
@@ -4286,7 +4332,6 @@
           <w:rFonts w:ascii="Times New Roman" w:hAnsi="Times New Roman" w:cs="Times New Roman"/>
           <w:sz w:val="28"/>
           <w:szCs w:val="28"/>
-          <w:lang w:val="en-US"/>
         </w:rPr>
       </w:pPr>
     </w:p>
@@ -4298,7 +4343,6 @@
           <w:rFonts w:ascii="Times New Roman" w:hAnsi="Times New Roman" w:cs="Times New Roman"/>
           <w:sz w:val="28"/>
           <w:szCs w:val="28"/>
-          <w:lang w:val="en-US"/>
         </w:rPr>
       </w:pPr>
     </w:p>
@@ -4310,7 +4354,6 @@
           <w:rFonts w:ascii="Times New Roman" w:hAnsi="Times New Roman" w:cs="Times New Roman"/>
           <w:sz w:val="28"/>
           <w:szCs w:val="28"/>
-          <w:lang w:val="en-US"/>
         </w:rPr>
       </w:pPr>
     </w:p>
@@ -4322,7 +4365,6 @@
           <w:rFonts w:ascii="Times New Roman" w:hAnsi="Times New Roman" w:cs="Times New Roman"/>
           <w:sz w:val="28"/>
           <w:szCs w:val="28"/>
-          <w:lang w:val="en-US"/>
         </w:rPr>
       </w:pPr>
     </w:p>
@@ -4334,7 +4376,6 @@
           <w:rFonts w:ascii="Times New Roman" w:hAnsi="Times New Roman" w:cs="Times New Roman"/>
           <w:sz w:val="28"/>
           <w:szCs w:val="28"/>
-          <w:lang w:val="en-US"/>
         </w:rPr>
       </w:pPr>
     </w:p>
@@ -4346,7 +4387,6 @@
           <w:rFonts w:ascii="Times New Roman" w:hAnsi="Times New Roman" w:cs="Times New Roman"/>
           <w:sz w:val="28"/>
           <w:szCs w:val="28"/>
-          <w:lang w:val="en-US"/>
         </w:rPr>
       </w:pPr>
     </w:p>
@@ -4358,7 +4398,6 @@
           <w:rFonts w:ascii="Times New Roman" w:hAnsi="Times New Roman" w:cs="Times New Roman"/>
           <w:sz w:val="28"/>
           <w:szCs w:val="28"/>
-          <w:lang w:val="en-US"/>
         </w:rPr>
       </w:pPr>
     </w:p>
@@ -4370,7 +4409,6 @@
           <w:rFonts w:ascii="Times New Roman" w:hAnsi="Times New Roman" w:cs="Times New Roman"/>
           <w:sz w:val="28"/>
           <w:szCs w:val="28"/>
-          <w:lang w:val="en-US"/>
         </w:rPr>
       </w:pPr>
     </w:p>
@@ -4382,7 +4420,6 @@
           <w:rFonts w:ascii="Times New Roman" w:hAnsi="Times New Roman" w:cs="Times New Roman"/>
           <w:sz w:val="28"/>
           <w:szCs w:val="28"/>
-          <w:lang w:val="en-US"/>
         </w:rPr>
       </w:pPr>
     </w:p>
@@ -4465,28 +4502,15 @@
       </w:r>
     </w:p>
     <w:p>
-      <w:pPr>
-        <w:pStyle w:val="HTML"/>
-        <w:ind w:left="720"/>
-        <w:rPr>
-          <w:rFonts w:ascii="Times New Roman" w:hAnsi="Times New Roman" w:cs="Times New Roman"/>
-          <w:sz w:val="28"/>
-          <w:szCs w:val="28"/>
-          <w:lang w:val="en-US"/>
-        </w:rPr>
-      </w:pPr>
-      <w:r>
-        <w:rPr>
-          <w:rFonts w:ascii="Times New Roman" w:hAnsi="Times New Roman" w:cs="Times New Roman"/>
+      <w:r>
+        <w:rPr>
           <w:noProof/>
-          <w:sz w:val="28"/>
-          <w:szCs w:val="28"/>
         </w:rPr>
         <w:drawing>
-          <wp:inline distT="0" distB="0" distL="0" distR="0" wp14:anchorId="0028D3D0" wp14:editId="50B8A2A7">
-            <wp:extent cx="4834032" cy="3739076"/>
-            <wp:effectExtent l="0" t="0" r="5080" b="0"/>
-            <wp:docPr id="6" name="Рисунок 6"/>
+          <wp:inline distT="0" distB="0" distL="0" distR="0" wp14:anchorId="63298DB2" wp14:editId="1E748E12">
+            <wp:extent cx="5940425" cy="4624705"/>
+            <wp:effectExtent l="0" t="0" r="3175" b="0"/>
+            <wp:docPr id="84565497" name="Рисунок 1"/>
             <wp:cNvGraphicFramePr>
               <a:graphicFrameLocks xmlns:a="http://schemas.openxmlformats.org/drawingml/2006/main" noChangeAspect="1"/>
             </wp:cNvGraphicFramePr>
@@ -4494,7 +4518,7 @@
               <a:graphicData uri="http://schemas.openxmlformats.org/drawingml/2006/picture">
                 <pic:pic xmlns:pic="http://schemas.openxmlformats.org/drawingml/2006/picture">
                   <pic:nvPicPr>
-                    <pic:cNvPr id="6" name="photo_2026-09-30_20-36-28.jpg"/>
+                    <pic:cNvPr id="84565497" name="Рисунок 84565497"/>
                     <pic:cNvPicPr/>
                   </pic:nvPicPr>
                   <pic:blipFill>
@@ -4512,7 +4536,7 @@
                   <pic:spPr>
                     <a:xfrm>
                       <a:off x="0" y="0"/>
-                      <a:ext cx="4841595" cy="3744926"/>
+                      <a:ext cx="5940425" cy="4624705"/>
                     </a:xfrm>
                     <a:prstGeom prst="rect">
                       <a:avLst/>
@@ -4525,7 +4549,6 @@
         </w:drawing>
       </w:r>
     </w:p>
-    <w:p/>
     <w:sectPr>
       <w:pgSz w:w="11906" w:h="16838"/>
       <w:pgMar w:top="1134" w:right="850" w:bottom="1134" w:left="1701" w:header="708" w:footer="708" w:gutter="0"/>

</xml_diff>

<commit_message>
Fix report third time
</commit_message>
<xml_diff>
--- a/лр2 СПО Михлин Платонова.docx
+++ b/лр2 СПО Михлин Платонова.docx
@@ -4115,7 +4115,15 @@
           <w:sz w:val="28"/>
           <w:szCs w:val="28"/>
         </w:rPr>
-        <w:t xml:space="preserve"> = 20</w:t>
+        <w:t xml:space="preserve"> = </w:t>
+      </w:r>
+      <w:r>
+        <w:rPr>
+          <w:rFonts w:ascii="Times New Roman" w:hAnsi="Times New Roman" w:cs="Times New Roman"/>
+          <w:sz w:val="28"/>
+          <w:szCs w:val="28"/>
+        </w:rPr>
+        <w:t>19</w:t>
       </w:r>
     </w:p>
     <w:p>
@@ -4126,6 +4134,7 @@
           <w:rFonts w:ascii="Times New Roman" w:hAnsi="Times New Roman" w:cs="Times New Roman"/>
           <w:sz w:val="28"/>
           <w:szCs w:val="28"/>
+          <w:lang w:val="en-US"/>
         </w:rPr>
       </w:pPr>
       <w:r>
@@ -4191,7 +4200,49 @@
           <w:sz w:val="28"/>
           <w:szCs w:val="28"/>
         </w:rPr>
-        <w:t xml:space="preserve"> = 20 / 59 = 0.339</w:t>
+        <w:t xml:space="preserve"> = </w:t>
+      </w:r>
+      <w:r>
+        <w:rPr>
+          <w:rFonts w:ascii="Times New Roman" w:hAnsi="Times New Roman" w:cs="Times New Roman"/>
+          <w:sz w:val="28"/>
+          <w:szCs w:val="28"/>
+          <w:lang w:val="en-US"/>
+        </w:rPr>
+        <w:t>19</w:t>
+      </w:r>
+      <w:r>
+        <w:rPr>
+          <w:rFonts w:ascii="Times New Roman" w:hAnsi="Times New Roman" w:cs="Times New Roman"/>
+          <w:sz w:val="28"/>
+          <w:szCs w:val="28"/>
+        </w:rPr>
+        <w:t xml:space="preserve"> / </w:t>
+      </w:r>
+      <w:r>
+        <w:rPr>
+          <w:rFonts w:ascii="Times New Roman" w:hAnsi="Times New Roman" w:cs="Times New Roman"/>
+          <w:sz w:val="28"/>
+          <w:szCs w:val="28"/>
+        </w:rPr>
+        <w:t>57</w:t>
+      </w:r>
+      <w:r>
+        <w:rPr>
+          <w:rFonts w:ascii="Times New Roman" w:hAnsi="Times New Roman" w:cs="Times New Roman"/>
+          <w:sz w:val="28"/>
+          <w:szCs w:val="28"/>
+        </w:rPr>
+        <w:t xml:space="preserve"> = 0.33</w:t>
+      </w:r>
+      <w:r>
+        <w:rPr>
+          <w:rFonts w:ascii="Times New Roman" w:hAnsi="Times New Roman" w:cs="Times New Roman"/>
+          <w:sz w:val="28"/>
+          <w:szCs w:val="28"/>
+          <w:lang w:val="en-US"/>
+        </w:rPr>
+        <w:t>3</w:t>
       </w:r>
     </w:p>
     <w:p>
@@ -4507,10 +4558,10 @@
           <w:noProof/>
         </w:rPr>
         <w:drawing>
-          <wp:inline distT="0" distB="0" distL="0" distR="0" wp14:anchorId="63298DB2" wp14:editId="1E748E12">
-            <wp:extent cx="5940425" cy="4624705"/>
-            <wp:effectExtent l="0" t="0" r="3175" b="0"/>
-            <wp:docPr id="84565497" name="Рисунок 1"/>
+          <wp:inline distT="0" distB="0" distL="0" distR="0" wp14:anchorId="0032CCC2" wp14:editId="6604864A">
+            <wp:extent cx="5940425" cy="4609465"/>
+            <wp:effectExtent l="0" t="0" r="3175" b="635"/>
+            <wp:docPr id="1789449881" name="Рисунок 1"/>
             <wp:cNvGraphicFramePr>
               <a:graphicFrameLocks xmlns:a="http://schemas.openxmlformats.org/drawingml/2006/main" noChangeAspect="1"/>
             </wp:cNvGraphicFramePr>
@@ -4518,7 +4569,7 @@
               <a:graphicData uri="http://schemas.openxmlformats.org/drawingml/2006/picture">
                 <pic:pic xmlns:pic="http://schemas.openxmlformats.org/drawingml/2006/picture">
                   <pic:nvPicPr>
-                    <pic:cNvPr id="84565497" name="Рисунок 84565497"/>
+                    <pic:cNvPr id="1789449881" name="Рисунок 1789449881"/>
                     <pic:cNvPicPr/>
                   </pic:nvPicPr>
                   <pic:blipFill>
@@ -4536,7 +4587,7 @@
                   <pic:spPr>
                     <a:xfrm>
                       <a:off x="0" y="0"/>
-                      <a:ext cx="5940425" cy="4624705"/>
+                      <a:ext cx="5940425" cy="4609465"/>
                     </a:xfrm>
                     <a:prstGeom prst="rect">
                       <a:avLst/>

</xml_diff>